<commit_message>
feat: adiciona dia de pagamento para vendedor e SDR
- Campo dia de pagamento aparece no formulário para vendedor e SDR
- Templates vendedor e SDR agora usam {dia_pagamento}/{dia_pagamento_extenso}
- Campos adicionados ao fill.html e CAMPOS_OBRIGATORIOS no servidor

Co-Authored-By: Claude Sonnet 4.6 <noreply@anthropic.com>
</commit_message>
<xml_diff>
--- a/templates/processed/vendedor.docx
+++ b/templates/processed/vendedor.docx
@@ -3591,35 +3591,35 @@
           <w:rFonts w:ascii="Book Antiqua" w:eastAsia="Book Antiqua" w:hAnsi="Book Antiqua" w:cs="Book Antiqua"/>
           <w:sz w:val="22"/>
         </w:rPr>
-        <w:t>4.3- Os pagamentos referentes à remuneração variável d</w:t>
-      </w:r>
-      <w:r>
-        <w:rPr>
-          <w:rFonts w:ascii="Book Antiqua" w:eastAsia="Book Antiqua" w:hAnsi="Book Antiqua" w:cs="Book Antiqua"/>
-          <w:sz w:val="22"/>
-        </w:rPr>
-        <w:t>a</w:t>
-      </w:r>
-      <w:r>
-        <w:rPr>
-          <w:rFonts w:ascii="Book Antiqua" w:eastAsia="Book Antiqua" w:hAnsi="Book Antiqua" w:cs="Book Antiqua"/>
-          <w:sz w:val="22"/>
-        </w:rPr>
-        <w:t xml:space="preserve"> CONTRATAD</w:t>
-      </w:r>
-      <w:r>
-        <w:rPr>
-          <w:rFonts w:ascii="Book Antiqua" w:eastAsia="Book Antiqua" w:hAnsi="Book Antiqua" w:cs="Book Antiqua"/>
-          <w:sz w:val="22"/>
-        </w:rPr>
-        <w:t>A</w:t>
-      </w:r>
-      <w:r>
-        <w:rPr>
-          <w:rFonts w:ascii="Book Antiqua" w:eastAsia="Book Antiqua" w:hAnsi="Book Antiqua" w:cs="Book Antiqua"/>
-          <w:sz w:val="22"/>
-        </w:rPr>
-        <w:t xml:space="preserve"> serão realizados até o dia 20 (vinte) do mês subsequente ao mês de apuração do desempenho e faturamento. </w:t>
+        <w:t xml:space="preserve">4.3- Os pagamentos referentes à remuneração variável da CONTRATADA serão realizados até o dia {dia_pagamento} ({dia_pagamento_extenso}) do mês subsequente ao mês de apuração do desempenho e faturamento. </w:t>
+      </w:r>
+      <w:r>
+        <w:rPr>
+          <w:rFonts w:ascii="Book Antiqua" w:eastAsia="Book Antiqua" w:hAnsi="Book Antiqua" w:cs="Book Antiqua"/>
+          <w:sz w:val="22"/>
+        </w:rPr>
+        <w:t/>
+      </w:r>
+      <w:r>
+        <w:rPr>
+          <w:rFonts w:ascii="Book Antiqua" w:eastAsia="Book Antiqua" w:hAnsi="Book Antiqua" w:cs="Book Antiqua"/>
+          <w:sz w:val="22"/>
+        </w:rPr>
+        <w:t xml:space="preserve"/>
+      </w:r>
+      <w:r>
+        <w:rPr>
+          <w:rFonts w:ascii="Book Antiqua" w:eastAsia="Book Antiqua" w:hAnsi="Book Antiqua" w:cs="Book Antiqua"/>
+          <w:sz w:val="22"/>
+        </w:rPr>
+        <w:t/>
+      </w:r>
+      <w:r>
+        <w:rPr>
+          <w:rFonts w:ascii="Book Antiqua" w:eastAsia="Book Antiqua" w:hAnsi="Book Antiqua" w:cs="Book Antiqua"/>
+          <w:sz w:val="22"/>
+        </w:rPr>
+        <w:t xml:space="preserve"/>
       </w:r>
     </w:p>
     <w:p>

</xml_diff>

<commit_message>
refactor: remove análise com IA (sem custo extra) + corrige nome Gestor de Tráfego
Co-Authored-By: Claude Sonnet 4.6 <noreply@anthropic.com>
</commit_message>
<xml_diff>
--- a/templates/processed/vendedor.docx
+++ b/templates/processed/vendedor.docx
@@ -113,7 +113,6 @@
           <w:rFonts w:ascii="Book Antiqua" w:eastAsia="Book Antiqua" w:hAnsi="Book Antiqua" w:cs="Book Antiqua"/>
           <w:b/>
           <w:bCs/>
-          <w:color w:val="FF0000"/>
           <w:sz w:val="22"/>
         </w:rPr>
         <w:t/>
@@ -143,7 +142,6 @@
       <w:r>
         <w:rPr>
           <w:rFonts w:ascii="Book Antiqua" w:eastAsia="Book Antiqua" w:hAnsi="Book Antiqua" w:cs="Book Antiqua"/>
-          <w:color w:val="FF0000"/>
           <w:sz w:val="22"/>
         </w:rPr>
         <w:t/>
@@ -152,7 +150,6 @@
       <w:r>
         <w:rPr>
           <w:rFonts w:ascii="Book Antiqua" w:eastAsia="Book Antiqua" w:hAnsi="Book Antiqua" w:cs="Book Antiqua"/>
-          <w:color w:val="FF0000"/>
           <w:sz w:val="22"/>
         </w:rPr>
         <w:t/>
@@ -160,7 +157,6 @@
       <w:r>
         <w:rPr>
           <w:rFonts w:ascii="Book Antiqua" w:eastAsia="Book Antiqua" w:hAnsi="Book Antiqua" w:cs="Book Antiqua"/>
-          <w:color w:val="FF0000"/>
           <w:sz w:val="22"/>
         </w:rPr>
         <w:t/>
@@ -175,7 +171,6 @@
       <w:r>
         <w:rPr>
           <w:rFonts w:ascii="Book Antiqua" w:eastAsia="Book Antiqua" w:hAnsi="Book Antiqua" w:cs="Book Antiqua"/>
-          <w:color w:val="FF0000"/>
           <w:sz w:val="22"/>
         </w:rPr>
         <w:t/>
@@ -183,7 +178,6 @@
       <w:r>
         <w:rPr>
           <w:rFonts w:ascii="Book Antiqua" w:eastAsia="Book Antiqua" w:hAnsi="Book Antiqua" w:cs="Book Antiqua"/>
-          <w:color w:val="FF0000"/>
           <w:sz w:val="22"/>
         </w:rPr>
         <w:t/>
@@ -192,7 +186,6 @@
       <w:r>
         <w:rPr>
           <w:rFonts w:ascii="Book Antiqua" w:eastAsia="Book Antiqua" w:hAnsi="Book Antiqua" w:cs="Book Antiqua"/>
-          <w:color w:val="FF0000"/>
           <w:sz w:val="22"/>
         </w:rPr>
         <w:t/>
@@ -201,7 +194,6 @@
       <w:r>
         <w:rPr>
           <w:rFonts w:ascii="Book Antiqua" w:eastAsia="Book Antiqua" w:hAnsi="Book Antiqua" w:cs="Book Antiqua"/>
-          <w:color w:val="FF0000"/>
           <w:sz w:val="22"/>
         </w:rPr>
         <w:t xml:space="preserve"/>
@@ -210,7 +202,6 @@
       <w:r>
         <w:rPr>
           <w:rFonts w:ascii="Book Antiqua" w:eastAsia="Book Antiqua" w:hAnsi="Book Antiqua" w:cs="Book Antiqua"/>
-          <w:color w:val="FF0000"/>
           <w:sz w:val="22"/>
         </w:rPr>
         <w:t/>
@@ -219,7 +210,6 @@
       <w:r>
         <w:rPr>
           <w:rFonts w:ascii="Book Antiqua" w:eastAsia="Book Antiqua" w:hAnsi="Book Antiqua" w:cs="Book Antiqua"/>
-          <w:color w:val="FF0000"/>
           <w:sz w:val="22"/>
         </w:rPr>
         <w:t xml:space="preserve"/>
@@ -228,7 +218,6 @@
       <w:r>
         <w:rPr>
           <w:rFonts w:ascii="Book Antiqua" w:eastAsia="Book Antiqua" w:hAnsi="Book Antiqua" w:cs="Book Antiqua"/>
-          <w:color w:val="FF0000"/>
           <w:sz w:val="22"/>
         </w:rPr>
         <w:t/>
@@ -237,7 +226,6 @@
       <w:r>
         <w:rPr>
           <w:rFonts w:ascii="Book Antiqua" w:eastAsia="Book Antiqua" w:hAnsi="Book Antiqua" w:cs="Book Antiqua"/>
-          <w:color w:val="FF0000"/>
           <w:sz w:val="22"/>
         </w:rPr>
         <w:t xml:space="preserve"/>
@@ -246,7 +234,6 @@
       <w:r>
         <w:rPr>
           <w:rFonts w:ascii="Book Antiqua" w:eastAsia="Book Antiqua" w:hAnsi="Book Antiqua" w:cs="Book Antiqua"/>
-          <w:color w:val="FF0000"/>
           <w:sz w:val="22"/>
         </w:rPr>
         <w:t/>
@@ -255,7 +242,6 @@
       <w:r>
         <w:rPr>
           <w:rFonts w:ascii="Book Antiqua" w:eastAsia="Book Antiqua" w:hAnsi="Book Antiqua" w:cs="Book Antiqua"/>
-          <w:color w:val="FF0000"/>
           <w:sz w:val="22"/>
         </w:rPr>
         <w:t xml:space="preserve"/>
@@ -264,7 +250,6 @@
       <w:r>
         <w:rPr>
           <w:rFonts w:ascii="Book Antiqua" w:eastAsia="Book Antiqua" w:hAnsi="Book Antiqua" w:cs="Book Antiqua"/>
-          <w:color w:val="FF0000"/>
           <w:sz w:val="22"/>
         </w:rPr>
         <w:t/>
@@ -273,7 +258,6 @@
       <w:r>
         <w:rPr>
           <w:rFonts w:ascii="Book Antiqua" w:eastAsia="Book Antiqua" w:hAnsi="Book Antiqua" w:cs="Book Antiqua"/>
-          <w:color w:val="FF0000"/>
           <w:sz w:val="22"/>
         </w:rPr>
         <w:t/>
@@ -282,7 +266,6 @@
       <w:r>
         <w:rPr>
           <w:rFonts w:ascii="Book Antiqua" w:eastAsia="Book Antiqua" w:hAnsi="Book Antiqua" w:cs="Book Antiqua"/>
-          <w:color w:val="FF0000"/>
           <w:sz w:val="22"/>
         </w:rPr>
         <w:t/>
@@ -291,7 +274,6 @@
       <w:r>
         <w:rPr>
           <w:rFonts w:ascii="Book Antiqua" w:eastAsia="Book Antiqua" w:hAnsi="Book Antiqua" w:cs="Book Antiqua"/>
-          <w:color w:val="FF0000"/>
           <w:sz w:val="22"/>
         </w:rPr>
         <w:t/>
@@ -299,7 +281,6 @@
       <w:r>
         <w:rPr>
           <w:rFonts w:ascii="Book Antiqua" w:eastAsia="Book Antiqua" w:hAnsi="Book Antiqua" w:cs="Book Antiqua"/>
-          <w:color w:val="FF0000"/>
           <w:sz w:val="22"/>
         </w:rPr>
         <w:t xml:space="preserve"/>
@@ -308,7 +289,6 @@
       <w:r>
         <w:rPr>
           <w:rFonts w:ascii="Book Antiqua" w:eastAsia="Book Antiqua" w:hAnsi="Book Antiqua" w:cs="Book Antiqua"/>
-          <w:color w:val="FF0000"/>
           <w:sz w:val="22"/>
         </w:rPr>
         <w:t/>
@@ -316,7 +296,6 @@
       <w:r>
         <w:rPr>
           <w:rFonts w:ascii="Book Antiqua" w:eastAsia="Book Antiqua" w:hAnsi="Book Antiqua" w:cs="Book Antiqua"/>
-          <w:color w:val="FF0000"/>
           <w:sz w:val="22"/>
         </w:rPr>
         <w:t/>
@@ -324,7 +303,6 @@
       <w:r>
         <w:rPr>
           <w:rFonts w:ascii="Book Antiqua" w:eastAsia="Book Antiqua" w:hAnsi="Book Antiqua" w:cs="Book Antiqua"/>
-          <w:color w:val="FF0000"/>
           <w:sz w:val="22"/>
         </w:rPr>
         <w:t/>
@@ -332,7 +310,6 @@
       <w:r>
         <w:rPr>
           <w:rFonts w:ascii="Book Antiqua" w:eastAsia="Book Antiqua" w:hAnsi="Book Antiqua" w:cs="Book Antiqua"/>
-          <w:color w:val="FF0000"/>
           <w:sz w:val="22"/>
         </w:rPr>
         <w:t/>
@@ -340,7 +317,6 @@
       <w:r>
         <w:rPr>
           <w:rFonts w:ascii="Book Antiqua" w:eastAsia="Book Antiqua" w:hAnsi="Book Antiqua" w:cs="Book Antiqua"/>
-          <w:color w:val="FF0000"/>
           <w:sz w:val="22"/>
         </w:rPr>
         <w:t/>
@@ -370,7 +346,6 @@
       <w:r>
         <w:rPr>
           <w:rFonts w:ascii="Book Antiqua" w:eastAsia="Book Antiqua" w:hAnsi="Book Antiqua" w:cs="Book Antiqua"/>
-          <w:color w:val="FF0000"/>
           <w:sz w:val="22"/>
         </w:rPr>
         <w:t/>
@@ -378,7 +353,6 @@
       <w:r>
         <w:rPr>
           <w:rFonts w:ascii="Book Antiqua" w:eastAsia="Book Antiqua" w:hAnsi="Book Antiqua" w:cs="Book Antiqua"/>
-          <w:color w:val="FF0000"/>
           <w:sz w:val="22"/>
         </w:rPr>
         <w:t xml:space="preserve"/>
@@ -394,7 +368,6 @@
       <w:r>
         <w:rPr>
           <w:rFonts w:ascii="Book Antiqua" w:eastAsia="Book Antiqua" w:hAnsi="Book Antiqua" w:cs="Book Antiqua"/>
-          <w:color w:val="FF0000"/>
           <w:sz w:val="22"/>
         </w:rPr>
         <w:t/>
@@ -403,7 +376,6 @@
       <w:r>
         <w:rPr>
           <w:rFonts w:ascii="Book Antiqua" w:eastAsia="Book Antiqua" w:hAnsi="Book Antiqua" w:cs="Book Antiqua"/>
-          <w:color w:val="FF0000"/>
           <w:sz w:val="22"/>
         </w:rPr>
         <w:t/>
@@ -427,7 +399,6 @@
           <w:rPr>
             <w:rStyle w:val="Hyperlink"/>
             <w:rFonts w:ascii="Book Antiqua" w:eastAsia="Book Antiqua" w:hAnsi="Book Antiqua" w:cs="Book Antiqua"/>
-            <w:color w:val="FF0000"/>
             <w:sz w:val="22"/>
           </w:rPr>
           <w:t/>
@@ -443,7 +414,6 @@
       <w:r>
         <w:rPr>
           <w:rFonts w:ascii="Book Antiqua" w:eastAsia="Book Antiqua" w:hAnsi="Book Antiqua" w:cs="Book Antiqua"/>
-          <w:color w:val="FF0000"/>
           <w:sz w:val="22"/>
         </w:rPr>
         <w:t/>
@@ -452,7 +422,6 @@
       <w:r>
         <w:rPr>
           <w:rFonts w:ascii="Book Antiqua" w:eastAsia="Book Antiqua" w:hAnsi="Book Antiqua" w:cs="Book Antiqua"/>
-          <w:color w:val="FF0000"/>
           <w:sz w:val="22"/>
         </w:rPr>
         <w:t/>
@@ -461,7 +430,6 @@
       <w:r>
         <w:rPr>
           <w:rFonts w:ascii="Book Antiqua" w:eastAsia="Book Antiqua" w:hAnsi="Book Antiqua" w:cs="Book Antiqua"/>
-          <w:color w:val="FF0000"/>
           <w:sz w:val="22"/>
         </w:rPr>
         <w:t xml:space="preserve"/>
@@ -470,7 +438,6 @@
       <w:r>
         <w:rPr>
           <w:rFonts w:ascii="Book Antiqua" w:eastAsia="Book Antiqua" w:hAnsi="Book Antiqua" w:cs="Book Antiqua"/>
-          <w:color w:val="FF0000"/>
           <w:sz w:val="22"/>
         </w:rPr>
         <w:t/>
@@ -478,7 +445,6 @@
       <w:r>
         <w:rPr>
           <w:rFonts w:ascii="Book Antiqua" w:eastAsia="Book Antiqua" w:hAnsi="Book Antiqua" w:cs="Book Antiqua"/>
-          <w:color w:val="FF0000"/>
           <w:sz w:val="22"/>
         </w:rPr>
         <w:t/>
@@ -486,7 +452,6 @@
       <w:r>
         <w:rPr>
           <w:rFonts w:ascii="Book Antiqua" w:eastAsia="Book Antiqua" w:hAnsi="Book Antiqua" w:cs="Book Antiqua"/>
-          <w:color w:val="FF0000"/>
           <w:sz w:val="22"/>
         </w:rPr>
         <w:t/>
@@ -4817,6 +4782,9 @@
           <w:sz w:val="22"/>
         </w:rPr>
       </w:pPr>
+      <w:r>
+        <w:br w:type="column"/>
+      </w:r>
     </w:p>
     <w:p>
       <w:pPr>
@@ -4847,7 +4815,6 @@
         <w:jc w:val="center"/>
         <w:rPr>
           <w:rFonts w:ascii="Book Antiqua" w:eastAsia="Book Antiqua" w:hAnsi="Book Antiqua" w:cs="Book Antiqua"/>
-          <w:color w:val="FF0000"/>
           <w:sz w:val="22"/>
         </w:rPr>
       </w:pPr>
@@ -4856,7 +4823,6 @@
           <w:rFonts w:ascii="Book Antiqua" w:eastAsia="Book Antiqua" w:hAnsi="Book Antiqua" w:cs="Book Antiqua"/>
           <w:b/>
           <w:bCs/>
-          <w:color w:val="FF0000"/>
           <w:sz w:val="22"/>
         </w:rPr>
         <w:t xml:space="preserve">{representante}</w:t>

</xml_diff>